<commit_message>
Tighten IEEESTEC manuscript layout
</commit_message>
<xml_diff>
--- a/rad/ieeestec_jazzdialog_revidiran.docx
+++ b/rad/ieeestec_jazzdialog_revidiran.docx
@@ -216,15 +216,6 @@
     </w:p>
     <w:p>
       <w:pPr>
-        <w:spacing w:after="40" w:line="240" w:lineRule="auto"/>
-        <w:jc w:val="both"/>
-      </w:pPr>
-      <w:r>
-        <w:t>U kasnijem koraku kandidati su rangirani korišćenjem DTW-a, incipita, odnosa dužina, zastupljenosti istih tonova, raznovrsnosti visina i približnog ponavljanja intervala. Negativno označeni primeri korišćeni su samo za blage kazne čestih loših obrazaca; obrazac nije strogo zabranjen, jer ponavljanje može biti deo validnog odgovora.</w:t>
-      </w:r>
-    </w:p>
-    <w:p>
-      <w:pPr>
         <w:pStyle w:val="Heading2"/>
         <w:spacing w:after="20" w:line="240" w:lineRule="auto" w:before="60"/>
         <w:jc w:val="left"/>
@@ -263,24 +254,26 @@
     </w:p>
     <w:p>
       <w:pPr>
-        <w:sectPr>
-          <w:type w:val="continuous"/>
-          <w:pgSz w:w="11906" w:h="16838"/>
-          <w:pgMar w:top="1020" w:right="1020" w:bottom="1020" w:left="1020" w:header="720" w:footer="720" w:gutter="0"/>
-          <w:cols w:space="300" w:num="2" w:equalWidth="1"/>
-          <w:docGrid w:linePitch="360"/>
-        </w:sectPr>
+        <w:spacing w:after="0" w:line="240" w:lineRule="auto"/>
+        <w:jc w:val="center"/>
       </w:pPr>
+      <w:r>
+        <w:rPr>
+          <w:b/>
+          <w:sz w:val="15"/>
+        </w:rPr>
+        <w:t>Primeri sa slike 1: (a) I Fall in Love Too Easily, melid 70, fraza 5; (b) Blues for Blanche, melid 2, fraza 39.</w:t>
+      </w:r>
     </w:p>
     <w:p>
       <w:pPr>
-        <w:spacing w:before="60" w:after="20"/>
+        <w:spacing w:before="40" w:after="20"/>
         <w:jc w:val="center"/>
       </w:pPr>
       <w:r>
         <w:drawing>
           <wp:inline xmlns:a="http://schemas.openxmlformats.org/drawingml/2006/main" xmlns:pic="http://schemas.openxmlformats.org/drawingml/2006/picture">
-            <wp:extent cx="5616000" cy="2159139"/>
+            <wp:extent cx="2718000" cy="1044968"/>
             <wp:docPr id="1" name="Picture 1"/>
             <wp:cNvGraphicFramePr>
               <a:graphicFrameLocks noChangeAspect="1"/>
@@ -301,7 +294,7 @@
                   <pic:spPr>
                     <a:xfrm>
                       <a:off x="0" y="0"/>
-                      <a:ext cx="5616000" cy="2159139"/>
+                      <a:ext cx="2718000" cy="1044968"/>
                     </a:xfrm>
                     <a:prstGeom prst="rect"/>
                   </pic:spPr>
@@ -319,19 +312,8 @@
         <w:jc w:val="both"/>
       </w:pPr>
       <w:r>
-        <w:t>Slika 1. Melodijske konture call-a i response-a za (a) prihvaćeni i (b) odbijeni kandidat. Horizontalna osa je redni broj note unutar segmenta, a vertikalna osa MIDI visina. Odbijeni primer ima znatno niži DTW skor, što pokazuje da skor sam nije odluka o muzičkoj funkciji.</w:t>
+        <w:t>Slika 1. Melodijske konture call-a i response-a za (a) I Fall in Love Too Easily i (b) Blues for Blanche. Horizontalna osa je redni broj note unutar segmenta, a vertikalna osa MIDI visina. Odbijeni primer ima znatno niži DTW skor, što pokazuje da skor sam nije odluka o muzičkoj funkciji.</w:t>
       </w:r>
-    </w:p>
-    <w:p>
-      <w:pPr>
-        <w:sectPr>
-          <w:type w:val="continuous"/>
-          <w:pgSz w:w="11906" w:h="16838"/>
-          <w:pgMar w:top="1020" w:right="1020" w:bottom="1020" w:left="1020" w:header="720" w:footer="720" w:gutter="0"/>
-          <w:cols w:space="300" w:num="1" w:equalWidth="1"/>
-          <w:docGrid w:linePitch="360"/>
-        </w:sectPr>
-      </w:pPr>
     </w:p>
     <w:p>
       <w:pPr>
@@ -344,24 +326,13 @@
     </w:p>
     <w:p>
       <w:pPr>
-        <w:sectPr>
-          <w:type w:val="continuous"/>
-          <w:pgSz w:w="11906" w:h="16838"/>
-          <w:pgMar w:top="1020" w:right="1020" w:bottom="1020" w:left="1020" w:header="720" w:footer="720" w:gutter="0"/>
-          <w:cols w:space="300" w:num="2" w:equalWidth="1"/>
-          <w:docGrid w:linePitch="360"/>
-        </w:sectPr>
-      </w:pPr>
-    </w:p>
-    <w:p>
-      <w:pPr>
-        <w:spacing w:before="60" w:after="20"/>
+        <w:spacing w:before="40" w:after="20"/>
         <w:jc w:val="center"/>
       </w:pPr>
       <w:r>
         <w:drawing>
           <wp:inline xmlns:a="http://schemas.openxmlformats.org/drawingml/2006/main" xmlns:pic="http://schemas.openxmlformats.org/drawingml/2006/picture">
-            <wp:extent cx="5616000" cy="3510000"/>
+            <wp:extent cx="2718000" cy="1698750"/>
             <wp:docPr id="2" name="Picture 2"/>
             <wp:cNvGraphicFramePr>
               <a:graphicFrameLocks noChangeAspect="1"/>
@@ -382,7 +353,7 @@
                   <pic:spPr>
                     <a:xfrm>
                       <a:off x="0" y="0"/>
-                      <a:ext cx="5616000" cy="3510000"/>
+                      <a:ext cx="2718000" cy="1698750"/>
                     </a:xfrm>
                     <a:prstGeom prst="rect"/>
                   </pic:spPr>
@@ -405,17 +376,6 @@
     </w:p>
     <w:p>
       <w:pPr>
-        <w:sectPr>
-          <w:type w:val="continuous"/>
-          <w:pgSz w:w="11906" w:h="16838"/>
-          <w:pgMar w:top="1020" w:right="1020" w:bottom="1020" w:left="1020" w:header="720" w:footer="720" w:gutter="0"/>
-          <w:cols w:space="300" w:num="1" w:equalWidth="1"/>
-          <w:docGrid w:linePitch="360"/>
-        </w:sectPr>
-      </w:pPr>
-    </w:p>
-    <w:p>
-      <w:pPr>
         <w:spacing w:after="40" w:line="240" w:lineRule="auto"/>
         <w:jc w:val="both"/>
       </w:pPr>
@@ -425,24 +385,13 @@
     </w:p>
     <w:p>
       <w:pPr>
-        <w:sectPr>
-          <w:type w:val="continuous"/>
-          <w:pgSz w:w="11906" w:h="16838"/>
-          <w:pgMar w:top="1020" w:right="1020" w:bottom="1020" w:left="1020" w:header="720" w:footer="720" w:gutter="0"/>
-          <w:cols w:space="300" w:num="2" w:equalWidth="1"/>
-          <w:docGrid w:linePitch="360"/>
-        </w:sectPr>
-      </w:pPr>
-    </w:p>
-    <w:p>
-      <w:pPr>
-        <w:spacing w:before="60" w:after="20"/>
+        <w:spacing w:before="40" w:after="20"/>
         <w:jc w:val="center"/>
       </w:pPr>
       <w:r>
         <w:drawing>
           <wp:inline xmlns:a="http://schemas.openxmlformats.org/drawingml/2006/main" xmlns:pic="http://schemas.openxmlformats.org/drawingml/2006/picture">
-            <wp:extent cx="5616000" cy="2450293"/>
+            <wp:extent cx="2718000" cy="1185879"/>
             <wp:docPr id="3" name="Picture 3"/>
             <wp:cNvGraphicFramePr>
               <a:graphicFrameLocks noChangeAspect="1"/>
@@ -463,7 +412,7 @@
                   <pic:spPr>
                     <a:xfrm>
                       <a:off x="0" y="0"/>
-                      <a:ext cx="5616000" cy="2450293"/>
+                      <a:ext cx="2718000" cy="1185879"/>
                     </a:xfrm>
                     <a:prstGeom prst="rect"/>
                   </pic:spPr>
@@ -483,17 +432,6 @@
       <w:r>
         <w:t>Slika 3. Udeo ručno prihvaćenih kandidata u prvih 20% rangirane liste. Stubovi upoređuju sve automatske kandidate i MLU podskup; prikaz je sažet na tri najinformativnija postupka.</w:t>
       </w:r>
-    </w:p>
-    <w:p>
-      <w:pPr>
-        <w:sectPr>
-          <w:type w:val="continuous"/>
-          <w:pgSz w:w="11906" w:h="16838"/>
-          <w:pgMar w:top="1020" w:right="1020" w:bottom="1020" w:left="1020" w:header="720" w:footer="720" w:gutter="0"/>
-          <w:cols w:space="300" w:num="1" w:equalWidth="1"/>
-          <w:docGrid w:linePitch="360"/>
-        </w:sectPr>
-      </w:pPr>
     </w:p>
     <w:p>
       <w:pPr>
@@ -594,6 +532,25 @@
       </w:pPr>
       <w:r>
         <w:t>Analizirane su stvarne jazz improvizacije da bi se izdvojili kandidati za call-and-response i ispitano je više načina njihovog numeričkog opisivanja. Melodijska sličnost, uključujući DTW, nije bila dovoljna za potvrdu odnosa, dok kombinovanje osobina može poboljšati rangiranje za ručni pregled. Hibridnim postupkom izdvajanja, rangiranja i preslušavanja nastala je JazzDialog baza sa 114 potvrđenih parova. Baza je osnova za proširenje anotacija, ljudsku evaluaciju i buduće modele jazz call-and-response improvizacije.</w:t>
+      </w:r>
+    </w:p>
+    <w:p>
+      <w:pPr>
+        <w:pStyle w:val="Heading2"/>
+        <w:spacing w:after="20" w:line="240" w:lineRule="auto" w:before="60"/>
+        <w:jc w:val="left"/>
+      </w:pPr>
+      <w:r>
+        <w:t>Dostupnost podataka</w:t>
+      </w:r>
+    </w:p>
+    <w:p>
+      <w:pPr>
+        <w:spacing w:after="40" w:line="240" w:lineRule="auto"/>
+        <w:jc w:val="both"/>
+      </w:pPr>
+      <w:r>
+        <w:t>JazzDialog baza, MIDI isečci i skripte za reprodukciju postupka dostupni su u javnom repozitorijumu github.com/NikolinaZdravkovic/jazzdialog.</w:t>
       </w:r>
     </w:p>
     <w:p>

</xml_diff>